<commit_message>
Add hackathon win, publication and industrial attachment to CV
- 1st place at the Mysoftheaven x CUET AI Hackathon; top 10 in 3+ national hackathons
- Mysoftheaven AI R&D industrial attachment (team lead, AI Security Gateway)
- ICCCNT 2025 paper, BUILD@CUET judge, ~500 CP problems, EDGE Django training
- Tighter layout to keep everything on one page

Co-Authored-By: Claude Opus 5.5 <noreply@anthropic.com>
</commit_message>
<xml_diff>
--- a/Jamil_Ahmad_Rupak.docx
+++ b/Jamil_Ahmad_Rupak.docx
@@ -173,7 +173,7 @@
               <w:jc w:val="both"/>
             </w:pPr>
             <w:r>
-              <w:t>Full-stack software engineer building production inventory, order and pricing systems for e-commerce clients at Algoclan, working mainly with Node.js/Express, Next.js, FastAPI and MongoDB. Final-year CSE student at CUET with top-10 finishes in 3+ national hackathons. I like taking messy real-world workflows (warehouse scanning, stock reconciliation, market pricing) and turning them into reliable software.</w:t>
+              <w:t>Full-stack software engineer building production inventory, order and pricing systems for e-commerce clients at Algoclan. Final-year CSE student at CUET; 1st place at the Mysoftheaven × CUET AI Hackathon, and top 10 in 3+ national hackathons. I like turning messy real-world workflows into reliable software.</w:t>
             </w:r>
           </w:p>
           <w:p>
@@ -243,7 +243,7 @@
               <w:spacing w:after="30"/>
             </w:pPr>
             <w:r>
-              <w:t>Built stock reconciliation against physical warehouse counts and applied a reconciled count of ~19,400 inventory rows to production, with rollback files prepared in advance.</w:t>
+              <w:t>Built stock reconciliation against physical warehouse counts and applied ~19,400 reconciled inventory rows to production, with rollback files prepared in advance.</w:t>
             </w:r>
           </w:p>
           <w:p>
@@ -252,7 +252,7 @@
               <w:spacing w:after="30"/>
             </w:pPr>
             <w:r>
-              <w:t>Automated order ingestion and cross-marketplace delisting so sold items stop being listed elsewhere; added multi-client onboarding and per-client inventory attribution.</w:t>
+              <w:t>Automated order ingestion and cross-marketplace delisting to prevent overselling; added multi-client onboarding and per-client attribution.</w:t>
             </w:r>
           </w:p>
           <w:p>
@@ -270,7 +270,29 @@
               <w:spacing w:after="30"/>
             </w:pPr>
             <w:r>
-              <w:t>Added audit logging, rate limiting, API-key auth and Swagger/OpenAPI docs to the platform API, plus an AI chatbot that produces weekly inventory analysis with CSV export.</w:t>
+              <w:t>Added audit logging, rate limiting, API-key auth, Swagger docs and an AI weekly-analysis chatbot; Dockerized and set up CI/CD for another product's backend.</w:t>
+            </w:r>
+          </w:p>
+          <w:p>
+            <w:pPr>
+              <w:tabs>
+                <w:tab w:pos="6768" w:val="right"/>
+              </w:tabs>
+              <w:spacing w:before="120" w:after="40"/>
+            </w:pPr>
+            <w:r>
+              <w:rPr>
+                <w:b/>
+              </w:rPr>
+              <w:t>AI R&amp;D Industrial Trainee (Team Lead), Mysoftheaven (BD) Ltd.</w:t>
+            </w:r>
+            <w:r>
+              <w:rPr>
+                <w:i/>
+                <w:sz w:val="18"/>
+              </w:rPr>
+              <w:tab/>
+              <w:t>Sep 2026</w:t>
             </w:r>
           </w:p>
           <w:p>
@@ -279,7 +301,7 @@
               <w:spacing w:after="30"/>
             </w:pPr>
             <w:r>
-              <w:t>Dockerized and set up CI/CD for another product's Node.js backend.</w:t>
+              <w:t>Led a 3-person team building an AI Security Gateway against LLM prompt injection and data leakage (OWASP LLM01/02): leakage-safe pipeline over 26k records, layered regex/ML/DeBERTa detection, and an audit replacing an inflated 100% detection claim with honest held-out metrics.</w:t>
             </w:r>
           </w:p>
           <w:p>
@@ -323,16 +345,7 @@
               <w:spacing w:after="30"/>
             </w:pPr>
             <w:r>
-              <w:t>Study app with flashcards scheduled by the SM-2 spaced-repetition algorithm, topic-organized notes and recurring tasks.</w:t>
-            </w:r>
-          </w:p>
-          <w:p>
-            <w:pPr>
-              <w:pStyle w:val="ListBullet"/>
-              <w:spacing w:after="30"/>
-            </w:pPr>
-            <w:r>
-              <w:t>Celery background jobs send email reminders; JWT auth and progress charts with Chart.js.</w:t>
+              <w:t>Study app with SM-2 spaced-repetition flashcards, topic notes and recurring tasks; Celery jobs send email reminders, with JWT auth and Chart.js progress charts.</w:t>
             </w:r>
           </w:p>
           <w:p>
@@ -397,6 +410,35 @@
               <w:t>Community web app where AI users share knowledge and discuss models, with authentication and a REST API.</w:t>
             </w:r>
           </w:p>
+          <w:p>
+            <w:pPr>
+              <w:spacing w:before="200" w:after="80"/>
+            </w:pPr>
+            <w:r>
+              <w:rPr>
+                <w:b/>
+                <w:color w:val="2E55A0"/>
+                <w:sz w:val="22"/>
+              </w:rPr>
+              <w:t>PUBLICATION</w:t>
+            </w:r>
+          </w:p>
+          <w:p>
+            <w:r>
+              <w:rPr>
+                <w:b/>
+              </w:rPr>
+              <w:t>Momentum: An E-Court Service and Lawyer Help Assistant Mobile Application</w:t>
+            </w:r>
+            <w:r>
+              <w:rPr>
+                <w:i/>
+                <w:sz w:val="18"/>
+              </w:rPr>
+              <w:br/>
+              <w:t>Presented at 16th ICCCNT 2025, IIT Indore (with IEEE EPS &amp; AICTE) · Jul 2025</w:t>
+            </w:r>
+          </w:p>
         </w:tc>
         <w:tc>
           <w:tcPr>
@@ -423,10 +465,9 @@
               <w:rPr>
                 <w:b/>
               </w:rPr>
-              <w:t>Languages:</w:t>
+              <w:t xml:space="preserve">Languages: </w:t>
             </w:r>
             <w:r>
-              <w:br/>
               <w:t>JavaScript, Python, Java, C++, C# (coursework)</w:t>
             </w:r>
           </w:p>
@@ -438,10 +479,9 @@
               <w:rPr>
                 <w:b/>
               </w:rPr>
-              <w:t>Backend:</w:t>
+              <w:t xml:space="preserve">Backend: </w:t>
             </w:r>
             <w:r>
-              <w:br/>
               <w:t>Node.js, Express, FastAPI, Django REST Framework</w:t>
             </w:r>
           </w:p>
@@ -453,10 +493,9 @@
               <w:rPr>
                 <w:b/>
               </w:rPr>
-              <w:t>Frontend:</w:t>
+              <w:t xml:space="preserve">Frontend: </w:t>
             </w:r>
             <w:r>
-              <w:br/>
               <w:t>React, Next.js, Tailwind CSS, shadcn/ui</w:t>
             </w:r>
           </w:p>
@@ -468,10 +507,9 @@
               <w:rPr>
                 <w:b/>
               </w:rPr>
-              <w:t>Databases:</w:t>
+              <w:t xml:space="preserve">Databases: </w:t>
             </w:r>
             <w:r>
-              <w:br/>
               <w:t>MongoDB, PostgreSQL, MySQL</w:t>
             </w:r>
           </w:p>
@@ -483,10 +521,9 @@
               <w:rPr>
                 <w:b/>
               </w:rPr>
-              <w:t>AI:</w:t>
+              <w:t xml:space="preserve">AI: </w:t>
             </w:r>
             <w:r>
-              <w:br/>
               <w:t>Vercel AI SDK, OpenAI &amp; Gemini APIs</w:t>
             </w:r>
           </w:p>
@@ -498,10 +535,9 @@
               <w:rPr>
                 <w:b/>
               </w:rPr>
-              <w:t>DevOps &amp; Tools:</w:t>
+              <w:t xml:space="preserve">DevOps &amp; Tools: </w:t>
             </w:r>
             <w:r>
-              <w:br/>
               <w:t>Docker, CI/CD, Git, Swagger/OpenAPI, cron jobs, Celery</w:t>
             </w:r>
           </w:p>
@@ -513,10 +549,9 @@
               <w:rPr>
                 <w:b/>
               </w:rPr>
-              <w:t>Fundamentals:</w:t>
+              <w:t xml:space="preserve">Fundamentals: </w:t>
             </w:r>
             <w:r>
-              <w:br/>
               <w:t>Data Structures &amp; Algorithms, OOP (C#), REST API design</w:t>
             </w:r>
           </w:p>
@@ -576,6 +611,28 @@
           </w:p>
           <w:p>
             <w:pPr>
+              <w:spacing w:before="120"/>
+            </w:pPr>
+            <w:r>
+              <w:rPr>
+                <w:b/>
+              </w:rPr>
+              <w:t>Python (Django) Training, 80 hrs</w:t>
+            </w:r>
+            <w:r>
+              <w:br/>
+              <w:t>EDGE Project, Bangladesh Computer Council, at CUET CSE</w:t>
+            </w:r>
+            <w:r>
+              <w:rPr>
+                <w:i/>
+              </w:rPr>
+              <w:br/>
+              <w:t>Sep – Dec 2024</w:t>
+            </w:r>
+          </w:p>
+          <w:p>
+            <w:pPr>
               <w:spacing w:before="200" w:after="80"/>
             </w:pPr>
             <w:r>
@@ -595,7 +652,7 @@
             <w:r>
               <w:t>•</w:t>
               <w:tab/>
-              <w:t>Top-10 finishes in 3+ national hackathons (7+ competed)</w:t>
+              <w:t>1st Place, AI Hackathon by Mysoftheaven (BD) Ltd. &amp; CUET CSE (2026)</w:t>
             </w:r>
           </w:p>
           <w:p>
@@ -606,7 +663,7 @@
             <w:r>
               <w:t>•</w:t>
               <w:tab/>
-              <w:t>Former Secretary, BAF Shaheen College Dhaka Math Club</w:t>
+              <w:t>Top 10 in 3+ national hackathons, incl. Micro-Ops, CUET CSE Fest 2025</w:t>
             </w:r>
           </w:p>
           <w:p>
@@ -617,7 +674,7 @@
             <w:r>
               <w:t>•</w:t>
               <w:tab/>
-              <w:t>President's Scout Award</w:t>
+              <w:t>Judge, BUILD@CUET Hackathon by MLH &amp; Gemini (2026)</w:t>
             </w:r>
           </w:p>
           <w:p>
@@ -628,7 +685,29 @@
             <w:r>
               <w:t>•</w:t>
               <w:tab/>
-              <w:t>Shapla Cub Award</w:t>
+              <w:t>~500 problems solved on Codeforces &amp; LeetCode</w:t>
+            </w:r>
+          </w:p>
+          <w:p>
+            <w:pPr>
+              <w:spacing w:after="40"/>
+              <w:ind w:left="216" w:hanging="216"/>
+            </w:pPr>
+            <w:r>
+              <w:t>•</w:t>
+              <w:tab/>
+              <w:t>Former Secretary, BAF Shaheen College Math Club</w:t>
+            </w:r>
+          </w:p>
+          <w:p>
+            <w:pPr>
+              <w:spacing w:after="40"/>
+              <w:ind w:left="216" w:hanging="216"/>
+            </w:pPr>
+            <w:r>
+              <w:t>•</w:t>
+              <w:tab/>
+              <w:t>President's Scout Award; Shapla Cub Award</w:t>
             </w:r>
           </w:p>
         </w:tc>

</xml_diff>